<commit_message>
Add info about the AP warning aural not cancelling until it has played at least once
</commit_message>
<xml_diff>
--- a/717/Auto_Flight_and_FCC.docx
+++ b/717/Auto_Flight_and_FCC.docx
@@ -111,7 +111,7 @@
           <w:sz w:val="24"/>
           <w:szCs w:val="24"/>
         </w:rPr>
-        <w:t>3/6/2026</w:t>
+        <w:t>4/24/2026</w:t>
       </w:r>
       <w:r>
         <w:rPr>
@@ -1974,14 +1974,12 @@
       <w:bookmarkEnd w:id="2"/>
     </w:p>
     <w:p>
-      <w:proofErr w:type="gramStart"/>
       <w:r>
         <w:t xml:space="preserve">The </w:t>
       </w:r>
       <w:r>
         <w:t>717</w:t>
       </w:r>
-      <w:proofErr w:type="gramEnd"/>
       <w:r>
         <w:t>’s</w:t>
       </w:r>
@@ -2010,15 +2008,7 @@
         <w:t>consists</w:t>
       </w:r>
       <w:r>
-        <w:t xml:space="preserve"> of 2 independent Autopilots (APs). Each system has a </w:t>
-      </w:r>
-      <w:proofErr w:type="gramStart"/>
-      <w:r>
-        <w:t>coupled</w:t>
-      </w:r>
-      <w:proofErr w:type="gramEnd"/>
-      <w:r>
-        <w:t xml:space="preserve"> Auto Thrust System (ATS).</w:t>
+        <w:t xml:space="preserve"> of 2 independent Autopilots (APs). Each system has a coupled Auto Thrust System (ATS).</w:t>
       </w:r>
       <w:r>
         <w:t xml:space="preserve"> The system is capable of automatically flying the aircraft from shortly after liftoff to touchdown and rollout.</w:t>
@@ -3139,15 +3129,7 @@
     </w:p>
     <w:p>
       <w:r>
-        <w:t xml:space="preserve">When </w:t>
-      </w:r>
-      <w:proofErr w:type="gramStart"/>
-      <w:r>
-        <w:t>not</w:t>
-      </w:r>
-      <w:proofErr w:type="gramEnd"/>
-      <w:r>
-        <w:t xml:space="preserve"> visible, the system</w:t>
+        <w:t>When not visible, the system</w:t>
       </w:r>
       <w:r>
         <w:t>s</w:t>
@@ -3174,15 +3156,7 @@
         <w:t xml:space="preserve"> </w:t>
       </w:r>
       <w:r>
-        <w:t xml:space="preserve">AP2 is displayed to indicate the active system. During </w:t>
-      </w:r>
-      <w:proofErr w:type="gramStart"/>
-      <w:r>
-        <w:t>a DUAL</w:t>
-      </w:r>
-      <w:proofErr w:type="gramEnd"/>
-      <w:r>
-        <w:t xml:space="preserve"> LAND, both APs are engaged, and simply A</w:t>
+        <w:t>AP2 is displayed to indicate the active system. During a DUAL LAND, both APs are engaged, and simply A</w:t>
       </w:r>
       <w:r>
         <w:t>P</w:t>
@@ -3912,13 +3886,8 @@
       <w:r>
         <w:t xml:space="preserve"> the </w:t>
       </w:r>
-      <w:proofErr w:type="gramStart"/>
-      <w:r>
-        <w:t>airspeed</w:t>
-      </w:r>
-      <w:proofErr w:type="gramEnd"/>
-      <w:r>
-        <w:t xml:space="preserve"> by adjusting pitch angle</w:t>
+      <w:r>
+        <w:t>airspeed by adjusting pitch angle</w:t>
       </w:r>
       <w:r>
         <w:t>,</w:t>
@@ -3975,15 +3944,7 @@
         <w:t xml:space="preserve"> any</w:t>
       </w:r>
       <w:r>
-        <w:t xml:space="preserve"> CLAMP mode, the throttle servos are </w:t>
-      </w:r>
-      <w:proofErr w:type="gramStart"/>
-      <w:r>
-        <w:t>unpowered</w:t>
-      </w:r>
-      <w:proofErr w:type="gramEnd"/>
-      <w:r>
-        <w:t xml:space="preserve"> and the levers can be moved by the pilot.</w:t>
+        <w:t xml:space="preserve"> CLAMP mode, the throttle servos are unpowered and the levers can be moved by the pilot.</w:t>
       </w:r>
       <w:r>
         <w:t xml:space="preserve"> </w:t>
@@ -4527,111 +4488,103 @@
         <w:t xml:space="preserve"> speed protection will engage and adjust the throttles </w:t>
       </w:r>
       <w:r>
-        <w:t xml:space="preserve">to correct the </w:t>
-      </w:r>
-      <w:proofErr w:type="gramStart"/>
-      <w:r>
-        <w:t>airspeed</w:t>
-      </w:r>
-      <w:proofErr w:type="gramEnd"/>
+        <w:t>to correct the airspeed.</w:t>
+      </w:r>
+      <w:r>
+        <w:t xml:space="preserve"> The current</w:t>
+      </w:r>
+      <w:r>
+        <w:t xml:space="preserve"> </w:t>
+      </w:r>
+      <w:r>
+        <w:t>vertical mode remains active.</w:t>
+      </w:r>
+    </w:p>
+    <w:p>
+      <w:r>
+        <w:t>At</w:t>
+      </w:r>
+      <w:r>
+        <w:t xml:space="preserve"> 10 knots above Vmax or</w:t>
+      </w:r>
+      <w:r>
+        <w:t xml:space="preserve"> 10 knots</w:t>
+      </w:r>
+      <w:r>
+        <w:t xml:space="preserve"> below Vmin</w:t>
+      </w:r>
+      <w:r>
+        <w:t xml:space="preserve">, </w:t>
+      </w:r>
+      <w:r>
+        <w:t>pitch</w:t>
+      </w:r>
+      <w:r>
+        <w:t xml:space="preserve"> </w:t>
+      </w:r>
+      <w:r>
+        <w:t xml:space="preserve">speed </w:t>
+      </w:r>
+      <w:r>
+        <w:t>protection</w:t>
+      </w:r>
+      <w:r>
+        <w:t xml:space="preserve"> will </w:t>
+      </w:r>
+      <w:r>
+        <w:t>engage</w:t>
+      </w:r>
       <w:r>
         <w:t>.</w:t>
       </w:r>
       <w:r>
-        <w:t xml:space="preserve"> The current</w:t>
-      </w:r>
-      <w:r>
         <w:t xml:space="preserve"> </w:t>
       </w:r>
       <w:r>
-        <w:t>vertical mode remains active.</w:t>
-      </w:r>
-    </w:p>
-    <w:p>
-      <w:r>
-        <w:t>At</w:t>
-      </w:r>
-      <w:r>
-        <w:t xml:space="preserve"> 10 knots above Vmax or</w:t>
-      </w:r>
-      <w:r>
-        <w:t xml:space="preserve"> 10 knots</w:t>
-      </w:r>
-      <w:r>
-        <w:t xml:space="preserve"> below Vmin</w:t>
-      </w:r>
-      <w:r>
-        <w:t xml:space="preserve">, </w:t>
+        <w:t>T</w:t>
+      </w:r>
+      <w:r>
+        <w:t xml:space="preserve">he throttles will be driven to the </w:t>
+      </w:r>
+      <w:r>
+        <w:t>min/max</w:t>
+      </w:r>
+      <w:r>
+        <w:t xml:space="preserve"> and</w:t>
+      </w:r>
+      <w:r>
+        <w:t xml:space="preserve"> the</w:t>
+      </w:r>
+      <w:r>
+        <w:t xml:space="preserve"> </w:t>
+      </w:r>
+      <w:r>
+        <w:t>p</w:t>
+      </w:r>
+      <w:r>
+        <w:t xml:space="preserve">itch angle </w:t>
+      </w:r>
+      <w:r>
+        <w:t>will be adjusted via AP or FD commands</w:t>
+      </w:r>
+      <w:r>
+        <w:t>.</w:t>
+      </w:r>
+      <w:r>
+        <w:t xml:space="preserve"> Pitch speed protection is inhibited when the vertical mode is HOLD</w:t>
+      </w:r>
+      <w:r>
+        <w:t xml:space="preserve"> to ensure the aircraft does not deviate from its assigned altitude.</w:t>
+      </w:r>
+    </w:p>
+    <w:p>
+      <w:r>
+        <w:t xml:space="preserve">If the throttles are already at their limit or the speed mode is PITCH, the AP goes directly into </w:t>
       </w:r>
       <w:r>
         <w:t>pitch</w:t>
       </w:r>
       <w:r>
-        <w:t xml:space="preserve"> </w:t>
-      </w:r>
-      <w:r>
-        <w:t xml:space="preserve">speed </w:t>
-      </w:r>
-      <w:r>
-        <w:t>protection</w:t>
-      </w:r>
-      <w:r>
-        <w:t xml:space="preserve"> will </w:t>
-      </w:r>
-      <w:r>
-        <w:t>engage</w:t>
-      </w:r>
-      <w:r>
-        <w:t>.</w:t>
-      </w:r>
-      <w:r>
-        <w:t xml:space="preserve"> </w:t>
-      </w:r>
-      <w:r>
-        <w:t>T</w:t>
-      </w:r>
-      <w:r>
-        <w:t xml:space="preserve">he throttles will be driven to the </w:t>
-      </w:r>
-      <w:r>
-        <w:t>min/max</w:t>
-      </w:r>
-      <w:r>
-        <w:t xml:space="preserve"> and</w:t>
-      </w:r>
-      <w:r>
-        <w:t xml:space="preserve"> the</w:t>
-      </w:r>
-      <w:r>
-        <w:t xml:space="preserve"> </w:t>
-      </w:r>
-      <w:r>
-        <w:t>p</w:t>
-      </w:r>
-      <w:r>
-        <w:t xml:space="preserve">itch angle </w:t>
-      </w:r>
-      <w:r>
-        <w:t>will be adjusted via AP or FD commands</w:t>
-      </w:r>
-      <w:r>
-        <w:t>.</w:t>
-      </w:r>
-      <w:r>
-        <w:t xml:space="preserve"> Pitch speed protection is inhibited when the vertical mode is HOLD</w:t>
-      </w:r>
-      <w:r>
-        <w:t xml:space="preserve"> to ensure the aircraft does not deviate from its assigned altitude.</w:t>
-      </w:r>
-    </w:p>
-    <w:p>
-      <w:r>
-        <w:t xml:space="preserve">If the throttles are already at their limit or the speed mode is PITCH, the AP goes directly into </w:t>
-      </w:r>
-      <w:r>
-        <w:t>pitch</w:t>
-      </w:r>
-      <w:r>
         <w:t xml:space="preserve"> speed protection.</w:t>
       </w:r>
     </w:p>
@@ -4645,13 +4598,8 @@
       <w:r>
         <w:t xml:space="preserve">recaptures the speed target and </w:t>
       </w:r>
-      <w:proofErr w:type="gramStart"/>
-      <w:r>
-        <w:t>continues on</w:t>
-      </w:r>
-      <w:proofErr w:type="gramEnd"/>
-      <w:r>
-        <w:t xml:space="preserve"> its current trajectory.</w:t>
+      <w:r>
+        <w:t>continues on its current trajectory.</w:t>
       </w:r>
     </w:p>
     <w:p/>
@@ -6767,13 +6715,8 @@
         </w:numPr>
       </w:pPr>
       <w:r>
-        <w:t xml:space="preserve">Push knobs by </w:t>
-      </w:r>
-      <w:proofErr w:type="gramStart"/>
-      <w:r>
-        <w:t>left clicking</w:t>
-      </w:r>
-      <w:proofErr w:type="gramEnd"/>
+        <w:t>Push knobs by left clicking</w:t>
+      </w:r>
     </w:p>
     <w:p>
       <w:pPr>
@@ -7380,15 +7323,7 @@
         <w:t>either</w:t>
       </w:r>
       <w:r>
-        <w:t xml:space="preserve"> AP1 </w:t>
-      </w:r>
-      <w:proofErr w:type="gramStart"/>
-      <w:r>
-        <w:t>and</w:t>
-      </w:r>
-      <w:proofErr w:type="gramEnd"/>
-      <w:r>
-        <w:t xml:space="preserve"> AP2</w:t>
+        <w:t xml:space="preserve"> AP1 and AP2</w:t>
       </w:r>
       <w:r>
         <w:t>. The engaged AP is</w:t>
@@ -7481,21 +7416,7 @@
         <w:rPr>
           <w:color w:val="000000" w:themeColor="text1"/>
         </w:rPr>
-        <w:t xml:space="preserve">Do not </w:t>
-      </w:r>
-      <w:proofErr w:type="gramStart"/>
-      <w:r>
-        <w:rPr>
-          <w:color w:val="000000" w:themeColor="text1"/>
-        </w:rPr>
-        <w:t>use</w:t>
-      </w:r>
-      <w:proofErr w:type="gramEnd"/>
-      <w:r>
-        <w:rPr>
-          <w:color w:val="000000" w:themeColor="text1"/>
-        </w:rPr>
-        <w:t xml:space="preserve"> during normal operation.</w:t>
+        <w:t>Do not use during normal operation.</w:t>
       </w:r>
       <w:r>
         <w:rPr>
@@ -8869,6 +8790,12 @@
         <w:t>. Aural warning will sound and the AP OFF box on the FMA will flash red. Second press silences the warning.</w:t>
       </w:r>
       <w:r>
+        <w:t xml:space="preserve"> </w:t>
+      </w:r>
+      <w:r>
+        <w:t>The warning will not reset until it has played at least once.</w:t>
+      </w:r>
+      <w:r>
         <w:br/>
       </w:r>
     </w:p>
@@ -8989,33 +8916,19 @@
         <w:rPr>
           <w:u w:val="single"/>
         </w:rPr>
-        <w:t xml:space="preserve"> (Both </w:t>
-      </w:r>
-      <w:proofErr w:type="gramStart"/>
+        <w:t xml:space="preserve"> (Both Throttles)</w:t>
+      </w:r>
       <w:r>
         <w:rPr>
           <w:u w:val="single"/>
         </w:rPr>
-        <w:t>Throttles)</w:t>
+        <w:t xml:space="preserve"> </w:t>
       </w:r>
       <w:r>
         <w:rPr>
           <w:u w:val="single"/>
         </w:rPr>
-        <w:t xml:space="preserve"> </w:t>
-      </w:r>
-      <w:r>
-        <w:rPr>
-          <w:u w:val="single"/>
-        </w:rPr>
-        <w:t xml:space="preserve"> (</w:t>
-      </w:r>
-      <w:proofErr w:type="gramEnd"/>
-      <w:r>
-        <w:rPr>
-          <w:u w:val="single"/>
-        </w:rPr>
-        <w:t>Ctrl + D)</w:t>
+        <w:t xml:space="preserve"> (Ctrl + D)</w:t>
       </w:r>
       <w:r>
         <w:rPr>
@@ -9158,15 +9071,7 @@
     </w:p>
     <w:p>
       <w:r>
-        <w:t xml:space="preserve">At high mach numbers, commands from the FCC </w:t>
-      </w:r>
-      <w:proofErr w:type="gramStart"/>
-      <w:r>
-        <w:t>applies</w:t>
-      </w:r>
-      <w:proofErr w:type="gramEnd"/>
-      <w:r>
-        <w:t xml:space="preserve"> slight nose up stabilizer trim. This increases the pitch up moment to counteract mach tuck. Mach trim is removed as the aircraft slows.</w:t>
+        <w:t>At high mach numbers, commands from the FCC applies slight nose up stabilizer trim. This increases the pitch up moment to counteract mach tuck. Mach trim is removed as the aircraft slows.</w:t>
       </w:r>
     </w:p>
     <w:p/>
@@ -10007,6 +9912,12 @@
       <w:r>
         <w:t>utton again.</w:t>
       </w:r>
+      <w:r>
+        <w:t xml:space="preserve"> </w:t>
+      </w:r>
+      <w:r>
+        <w:t>The warning will not reset until it has played at least once.</w:t>
+      </w:r>
     </w:p>
     <w:p/>
     <w:p>
@@ -10263,15 +10174,7 @@
         <w:t xml:space="preserve">When LOC engages, ensure LAND ARMED is </w:t>
       </w:r>
       <w:r>
-        <w:t xml:space="preserve">displayed in </w:t>
-      </w:r>
-      <w:proofErr w:type="gramStart"/>
-      <w:r>
-        <w:t>the vertical</w:t>
-      </w:r>
-      <w:proofErr w:type="gramEnd"/>
-      <w:r>
-        <w:t xml:space="preserve"> mode </w:t>
+        <w:t xml:space="preserve">displayed in the vertical mode </w:t>
       </w:r>
       <w:r>
         <w:t>on</w:t>
@@ -10390,15 +10293,7 @@
         </w:numPr>
       </w:pPr>
       <w:r>
-        <w:t xml:space="preserve">When on an intercept course (30 degrees or less recommended), select *LOC ONLY option </w:t>
-      </w:r>
-      <w:proofErr w:type="gramStart"/>
-      <w:r>
-        <w:t>in</w:t>
-      </w:r>
-      <w:proofErr w:type="gramEnd"/>
-      <w:r>
-        <w:t xml:space="preserve"> the MCDU NAV RAD page.</w:t>
+        <w:t>When on an intercept course (30 degrees or less recommended), select *LOC ONLY option in the MCDU NAV RAD page.</w:t>
       </w:r>
     </w:p>
     <w:p>

</xml_diff>